<commit_message>
docs: TB, HD bản 10, BC tiếp thu — ghi đúng tên phần mềm KPI của tỉnh (VNPT-ĐGCB); bỏ viện dẫn ý kiến TCCB ngày 06/10 trong BC
Co-Authored-By: Claude Opus 5.5 <noreply@anthropic.com>
</commit_message>
<xml_diff>
--- a/30-Ket-Qua/2026-10-12/Soan-Thao/BC_Tiep-thu-giai-trinh-tham-dinh-lan-2-QLKHCN-KTC-Quan-tri_20261012_v1.docx
+++ b/30-Ket-Qua/2026-10-12/Soan-Thao/BC_Tiep-thu-giai-trinh-tham-dinh-lan-2-QLKHCN-KTC-Quan-tri_20261012_v1.docx
@@ -2029,7 +2029,9 @@
         <w:noBreakHyphen/>
         <w:t xml:space="preserve">CĐKT ngày 28/9/2026 (dạng 1.1.DA01.01); mã nhiệm vụ chuẩn theo lĩnh vực; mã nhiệm vụ thống nhất (Task_ID). Mã sản phẩm, công việc do Trường ban hành tại Quyết định số 2119/QĐ</w:t>
         <w:noBreakHyphen/>
-        <w:t xml:space="preserve">CĐKT ngày 28/9/2026 chưa khớp với mã nhiệm vụ trên phần mềm quản lý KPI của tỉnh, nên Trường chưa thể quyết định chính thức mã nhiệm vụ để áp dụng. Trong thời gian này, Bộ công cụ chỉ ghi nhận mã sản phẩm, công việc do Trường ban hành, đối chiếu nhiệm vụ theo mã sản phẩm và tên nhiệm vụ (kết quả ghi mã cảnh báo “DOI_CHIEU_GAN_DUNG”, đơn vị đối chiếu thủ công trước khi ký), không cấp Task_ID. Dự thảo Thông báo, Tài liệu hướng dẫn bản 10 bỏ các nội dung “Task_ID dùng xuyên suốt”, câu lệnh “cấp Task_ID”; ghi rõ Task_ID chưa áp dụng cho đến khi Trường ban hành quy định mã nhiệm vụ phù hợp với phần mềm quản lý KPI của tỉnh.</w:t>
+        <w:t xml:space="preserve">CĐKT ngày 28/9/2026 chưa khớp với mã nhiệm vụ trên phần mềm KPI của tỉnh (Hệ thống quản lý đánh giá, xếp loại chất lượng cán bộ, công chức, viên chức VNPT</w:t>
+        <w:noBreakHyphen/>
+        <w:t xml:space="preserve">ĐGCB), nên Trường chưa thể quyết định chính thức mã nhiệm vụ để áp dụng. Trong thời gian này, Bộ công cụ chỉ ghi nhận mã sản phẩm, công việc do Trường ban hành, đối chiếu nhiệm vụ theo mã sản phẩm và tên nhiệm vụ (kết quả ghi mã cảnh báo “DOI_CHIEU_GAN_DUNG”, đơn vị đối chiếu thủ công trước khi ký), không cấp Task_ID. Dự thảo Thông báo, Tài liệu hướng dẫn bản 10 bỏ các nội dung “Task_ID dùng xuyên suốt”, câu lệnh “cấp Task_ID”; ghi rõ Task_ID chưa áp dụng cho đến khi Trường ban hành quy định mã nhiệm vụ phù hợp với phần mềm KPI của tỉnh.</w:t>
       </w:r>
     </w:p>
     <w:p>
@@ -2256,7 +2258,7 @@
         </w:rPr>
         <w:t xml:space="preserve">2.5. P0</w:t>
         <w:noBreakHyphen/>
-        <w:t xml:space="preserve">05: Chưa có bản gốc các quyết định, thông báo, mẫu được viện dẫn để xác nhận hiệu lực, quy tắc KPI và phương án quy đổi “A”.</w:t>
+        <w:t xml:space="preserve">05: Chưa có bản gốc các quyết định, thông báo, mẫu được viện dẫn để xác nhận hiệu lực, quy tắc KPI.</w:t>
       </w:r>
     </w:p>
     <w:p>
@@ -2295,9 +2297,9 @@
         <w:noBreakHyphen/>
         <w:t xml:space="preserve">CĐKT) là văn bản đã ban hành, có trên Hệ thống quản lý văn bản và điều hành của Trường và trong kho KTC</w:t>
         <w:noBreakHyphen/>
-        <w:t xml:space="preserve">Database; hồ sơ thẩm định chỉ gửi tệp công cụ và dự thảo nên bên thẩm định không có bản gốc. Phương án quy đổi “A” (chỉ theo hệ số sản phẩm tại Danh mục ban hành kèm theo Quyết định số 2119/QĐ</w:t>
-        <w:noBreakHyphen/>
-        <w:t xml:space="preserve">CĐKT ngày 28/9/2026) thực hiện theo ý kiến của Phòng TCCB&amp;CTHSSV ngày 06/10/2026; Bộ công cụ không tự đặt hệ số ngoài Danh mục.</w:t>
+        <w:t xml:space="preserve">Database; hồ sơ thẩm định chỉ gửi tệp công cụ và dự thảo nên bên thẩm định không có bản gốc. Hệ số quy đổi lấy đúng theo từng sản phẩm tại Danh mục ban hành kèm theo Quyết định số 2119/QĐ</w:t>
+        <w:noBreakHyphen/>
+        <w:t xml:space="preserve">CĐKT ngày 28/9/2026; Bộ công cụ không tự đặt hệ số ngoài Danh mục.</w:t>
       </w:r>
     </w:p>
     <w:p>

</xml_diff>